<commit_message>
just whent through my nea write up for gramemr checking
</commit_message>
<xml_diff>
--- a/nea photos/completed anotated screenshots/anotated stuff.docx
+++ b/nea photos/completed anotated screenshots/anotated stuff.docx
@@ -690,13 +690,7 @@
                         <w:txbxContent>
                           <w:p>
                             <w:r>
-                              <w:t xml:space="preserve">Pressed so the user can trigger the file to be </w:t>
-                            </w:r>
-                            <w:r>
-                              <w:t>open</w:t>
-                            </w:r>
-                            <w:r>
-                              <w:t xml:space="preserve">. </w:t>
+                              <w:t xml:space="preserve">Pressed so the user can trigger the file to be open. </w:t>
                             </w:r>
                           </w:p>
                         </w:txbxContent>
@@ -2242,21 +2236,14 @@
                         <w:txbxContent>
                           <w:p>
                             <w:r>
-                              <w:t xml:space="preserve">This is the arrow made from arrow mode. Its easily visible. You can also see the pieces which are show as pictures loaded from </w:t>
+                              <w:t>This is the arrow made from arrow mode. Its easily visible. You can also see the pieces which are show as pictures loaded from png</w:t>
                             </w:r>
-                            <w:proofErr w:type="spellStart"/>
                             <w:r>
-                              <w:t>pngs</w:t>
+                              <w:t>’</w:t>
                             </w:r>
-                            <w:proofErr w:type="spellEnd"/>
                             <w:r>
-                              <w:t xml:space="preserve"> and the board which is made from a 2D array of </w:t>
+                              <w:t>s and the board which is made from a 2D array of JButtons</w:t>
                             </w:r>
-                            <w:proofErr w:type="spellStart"/>
-                            <w:r>
-                              <w:t>JButtons</w:t>
-                            </w:r>
-                            <w:proofErr w:type="spellEnd"/>
                           </w:p>
                         </w:txbxContent>
                       </wps:txbx>
@@ -2280,26 +2267,23 @@
           </mc:Choice>
           <mc:Fallback>
             <w:pict>
-              <v:shape w14:anchorId="0A3FE0E3" id="Text Box 44" o:spid="_x0000_s1039" type="#_x0000_t202" style="position:absolute;margin-left:239pt;margin-top:451.5pt;width:274.5pt;height:95pt;z-index:251717632;visibility:visible;mso-wrap-style:square;mso-width-percent:0;mso-height-percent:0;mso-wrap-distance-left:9pt;mso-wrap-distance-top:0;mso-wrap-distance-right:9pt;mso-wrap-distance-bottom:0;mso-position-horizontal:absolute;mso-position-horizontal-relative:text;mso-position-vertical:absolute;mso-position-vertical-relative:text;mso-width-percent:0;mso-height-percent:0;mso-width-relative:margin;mso-height-relative:margin;v-text-anchor:top" o:gfxdata="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" fillcolor="white [3201]" strokecolor="white [3212]" strokeweight=".5pt">
+              <v:shapetype w14:anchorId="0A3FE0E3" id="_x0000_t202" coordsize="21600,21600" o:spt="202" path="m,l,21600r21600,l21600,xe">
+                <v:stroke joinstyle="miter"/>
+                <v:path gradientshapeok="t" o:connecttype="rect"/>
+              </v:shapetype>
+              <v:shape id="Text Box 44" o:spid="_x0000_s1039" type="#_x0000_t202" style="position:absolute;margin-left:239pt;margin-top:451.5pt;width:274.5pt;height:95pt;z-index:251717632;visibility:visible;mso-wrap-style:square;mso-width-percent:0;mso-height-percent:0;mso-wrap-distance-left:9pt;mso-wrap-distance-top:0;mso-wrap-distance-right:9pt;mso-wrap-distance-bottom:0;mso-position-horizontal:absolute;mso-position-horizontal-relative:text;mso-position-vertical:absolute;mso-position-vertical-relative:text;mso-width-percent:0;mso-height-percent:0;mso-width-relative:margin;mso-height-relative:margin;v-text-anchor:top" o:gfxdata="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" fillcolor="white [3201]" strokecolor="white [3212]" strokeweight=".5pt">
                 <v:textbox>
                   <w:txbxContent>
                     <w:p>
                       <w:r>
-                        <w:t xml:space="preserve">This is the arrow made from arrow mode. Its easily visible. You can also see the pieces which are show as pictures loaded from </w:t>
+                        <w:t>This is the arrow made from arrow mode. Its easily visible. You can also see the pieces which are show as pictures loaded from png</w:t>
                       </w:r>
-                      <w:proofErr w:type="spellStart"/>
                       <w:r>
-                        <w:t>pngs</w:t>
+                        <w:t>’</w:t>
                       </w:r>
-                      <w:proofErr w:type="spellEnd"/>
                       <w:r>
-                        <w:t xml:space="preserve"> and the board which is made from a 2D array of </w:t>
+                        <w:t>s and the board which is made from a 2D array of JButtons</w:t>
                       </w:r>
-                      <w:proofErr w:type="spellStart"/>
-                      <w:r>
-                        <w:t>JButtons</w:t>
-                      </w:r>
-                      <w:proofErr w:type="spellEnd"/>
                     </w:p>
                   </w:txbxContent>
                 </v:textbox>
@@ -3280,7 +3264,7 @@
           <w:noProof/>
         </w:rPr>
         <w:drawing>
-          <wp:anchor distT="0" distB="0" distL="114300" distR="114300" simplePos="0" relativeHeight="251701248" behindDoc="0" locked="0" layoutInCell="1" allowOverlap="1" wp14:anchorId="57922EE4" wp14:editId="74D03914">
+          <wp:anchor distT="0" distB="0" distL="114300" distR="114300" simplePos="0" relativeHeight="251701248" behindDoc="0" locked="0" layoutInCell="1" allowOverlap="1" wp14:anchorId="57922EE4" wp14:editId="5A5DA291">
             <wp:simplePos x="0" y="0"/>
             <wp:positionH relativeFrom="margin">
               <wp:align>right</wp:align>
@@ -3809,7 +3793,7 @@
           <w:noProof/>
         </w:rPr>
         <w:drawing>
-          <wp:anchor distT="0" distB="0" distL="114300" distR="114300" simplePos="0" relativeHeight="251661312" behindDoc="0" locked="0" layoutInCell="1" allowOverlap="1" wp14:anchorId="5BAB300E" wp14:editId="48A4BDA5">
+          <wp:anchor distT="0" distB="0" distL="114300" distR="114300" simplePos="0" relativeHeight="251661312" behindDoc="0" locked="0" layoutInCell="1" allowOverlap="1" wp14:anchorId="5BAB300E" wp14:editId="4CCFC8F8">
             <wp:simplePos x="0" y="0"/>
             <wp:positionH relativeFrom="margin">
               <wp:align>right</wp:align>

</xml_diff>